<commit_message>
Them file bao cao dinh dang Markdown
</commit_message>
<xml_diff>
--- a/report_Lab01.docx
+++ b/report_Lab01.docx
@@ -587,25 +587,7 @@
           <w:sz w:val="26"/>
           <w:szCs w:val="26"/>
         </w:rPr>
-        <w:t xml:space="preserve">3. Phần 2: Chèn hình ảnh minh họa (Từ thư mục </w:t>
-      </w:r>
-      <w:proofErr w:type="spellStart"/>
-      <w:r>
-        <w:rPr>
-          <w:rFonts w:asciiTheme="majorHAnsi" w:hAnsiTheme="majorHAnsi" w:cstheme="majorHAnsi"/>
-          <w:sz w:val="26"/>
-          <w:szCs w:val="26"/>
-        </w:rPr>
-        <w:t>figures</w:t>
-      </w:r>
-      <w:proofErr w:type="spellEnd"/>
-      <w:r>
-        <w:rPr>
-          <w:rFonts w:asciiTheme="majorHAnsi" w:hAnsiTheme="majorHAnsi" w:cstheme="majorHAnsi"/>
-          <w:sz w:val="26"/>
-          <w:szCs w:val="26"/>
-        </w:rPr>
-        <w:t>/)</w:t>
+        <w:t xml:space="preserve">3. Phần 2: Chèn hình ảnh minh họa </w:t>
       </w:r>
     </w:p>
     <w:p>

</xml_diff>